<commit_message>
Finalizing revision submission. Minor edits.
</commit_message>
<xml_diff>
--- a/kelly_weevil_2026_revised.docx
+++ b/kelly_weevil_2026_revised.docx
@@ -29,8 +29,27 @@
       <w:pPr>
         <w:pStyle w:val="FirstParagraph"/>
       </w:pPr>
-      <w:r>
-        <w:t>Body size can affect fecundity and access to mates in both sexes, yet field estimates of these components of selection are uncommon for females and males of the same population. I sampled paired and unpaired adults of an undescribed flightless New Zealand weevil (</w:t>
+      <w:bookmarkStart w:id="1" w:name="OLE_LINK8"/>
+      <w:r>
+        <w:t xml:space="preserve">Body size can affect fecundity and access to mates in both sexes, yet field estimates of these </w:t>
+      </w:r>
+      <w:r>
+        <w:t>selection</w:t>
+      </w:r>
+      <w:r>
+        <w:t xml:space="preserve"> </w:t>
+      </w:r>
+      <w:r>
+        <w:t>components</w:t>
+      </w:r>
+      <w:r>
+        <w:t xml:space="preserve"> are uncommon for females and males </w:t>
+      </w:r>
+      <w:r>
+        <w:t>in</w:t>
+      </w:r>
+      <w:r>
+        <w:t xml:space="preserve"> the same population. I sampled paired and unpaired adults of an undescribed flightless New Zealand weevil (</w:t>
       </w:r>
       <w:r>
         <w:rPr>
@@ -43,6 +62,7 @@
         <w:t xml:space="preserve"> sp. A) and examined body length, hind leg length, pairing status, female egg load, sexual dimorphism, and size assortment. Females were larger than males in both morphological traits, and longer females carried more eggs, consistent with fecundity selection favouring greater female size. In both sexes, body length was positively associated and hind leg length negatively associated with observed pairing status. The male analysis also supported nonlinear and correlational selection, with the highest predicted pairing probability among relatively large-bodied, short-legged males. A pooled comparison, however, did not clearly demonstrate that this correlational association differed between the sexes. Body length was not assortative within the 25 observed pairs. These results reveal size-dependent nonrandom pairing in both sexes and a fecundity-related advantage of female body size. They show that contemporary components of selection may contribute to female-biased dimorphism without mapping simply onto the magnitude of the observed sex differences.</w:t>
       </w:r>
     </w:p>
+    <w:bookmarkEnd w:id="1"/>
     <w:p>
       <w:r>
         <w:br w:type="page"/>
@@ -52,7 +72,7 @@
       <w:pPr>
         <w:pStyle w:val="Heading1"/>
       </w:pPr>
-      <w:bookmarkStart w:id="1" w:name="introduction"/>
+      <w:bookmarkStart w:id="2" w:name="introduction"/>
       <w:bookmarkEnd w:id="0"/>
       <w:r>
         <w:lastRenderedPageBreak/>
@@ -240,8 +260,8 @@
       <w:pPr>
         <w:pStyle w:val="Heading1"/>
       </w:pPr>
-      <w:bookmarkStart w:id="2" w:name="methods"/>
-      <w:bookmarkEnd w:id="1"/>
+      <w:bookmarkStart w:id="3" w:name="methods"/>
+      <w:bookmarkEnd w:id="2"/>
       <w:r>
         <w:t>Methods</w:t>
       </w:r>
@@ -250,7 +270,7 @@
       <w:pPr>
         <w:pStyle w:val="Heading3"/>
       </w:pPr>
-      <w:bookmarkStart w:id="3" w:name="study-species-and-field-sampling"/>
+      <w:bookmarkStart w:id="4" w:name="study-species-and-field-sampling"/>
       <w:r>
         <w:t>Study species and field sampling</w:t>
       </w:r>
@@ -344,8 +364,8 @@
       <w:pPr>
         <w:pStyle w:val="Heading3"/>
       </w:pPr>
-      <w:bookmarkStart w:id="4" w:name="ethical-note"/>
-      <w:bookmarkEnd w:id="3"/>
+      <w:bookmarkStart w:id="5" w:name="ethical-note"/>
+      <w:bookmarkEnd w:id="4"/>
       <w:r>
         <w:t>Ethical note</w:t>
       </w:r>
@@ -376,8 +396,8 @@
       <w:pPr>
         <w:pStyle w:val="Heading3"/>
       </w:pPr>
-      <w:bookmarkStart w:id="5" w:name="statistical-analyses"/>
-      <w:bookmarkEnd w:id="4"/>
+      <w:bookmarkStart w:id="6" w:name="statistical-analyses"/>
+      <w:bookmarkEnd w:id="5"/>
       <w:r>
         <w:t>Statistical analyses</w:t>
       </w:r>
@@ -713,9 +733,9 @@
       <w:pPr>
         <w:pStyle w:val="Heading1"/>
       </w:pPr>
-      <w:bookmarkStart w:id="6" w:name="results"/>
-      <w:bookmarkEnd w:id="2"/>
-      <w:bookmarkEnd w:id="5"/>
+      <w:bookmarkStart w:id="7" w:name="results"/>
+      <w:bookmarkEnd w:id="3"/>
+      <w:bookmarkEnd w:id="6"/>
       <w:r>
         <w:t>Results</w:t>
       </w:r>
@@ -724,7 +744,7 @@
       <w:pPr>
         <w:pStyle w:val="Heading3"/>
       </w:pPr>
-      <w:bookmarkStart w:id="7" w:name="sexual-dimorphism"/>
+      <w:bookmarkStart w:id="8" w:name="sexual-dimorphism"/>
       <w:r>
         <w:t>Sexual dimorphism</w:t>
       </w:r>
@@ -891,8 +911,8 @@
       <w:pPr>
         <w:pStyle w:val="Heading3"/>
       </w:pPr>
-      <w:bookmarkStart w:id="8" w:name="female-body-length-and-egg-load"/>
-      <w:bookmarkEnd w:id="7"/>
+      <w:bookmarkStart w:id="9" w:name="female-body-length-and-egg-load"/>
+      <w:bookmarkEnd w:id="8"/>
       <w:r>
         <w:lastRenderedPageBreak/>
         <w:t>Female body length and egg load</w:t>
@@ -942,8 +962,8 @@
       <w:pPr>
         <w:pStyle w:val="Heading3"/>
       </w:pPr>
-      <w:bookmarkStart w:id="9" w:name="X1772c2e304461a5827a2772122b29f8ad0ce73a"/>
-      <w:bookmarkEnd w:id="8"/>
+      <w:bookmarkStart w:id="10" w:name="X1772c2e304461a5827a2772122b29f8ad0ce73a"/>
+      <w:bookmarkEnd w:id="9"/>
       <w:r>
         <w:t>Phenotypic selection through observed pairing status</w:t>
       </w:r>
@@ -1182,8 +1202,8 @@
       <w:pPr>
         <w:pStyle w:val="Heading3"/>
       </w:pPr>
-      <w:bookmarkStart w:id="10" w:name="assortative-mating"/>
-      <w:bookmarkEnd w:id="9"/>
+      <w:bookmarkStart w:id="11" w:name="assortative-mating"/>
+      <w:bookmarkEnd w:id="10"/>
       <w:r>
         <w:t>Assortative mating</w:t>
       </w:r>
@@ -1231,9 +1251,9 @@
       <w:pPr>
         <w:pStyle w:val="Heading1"/>
       </w:pPr>
-      <w:bookmarkStart w:id="11" w:name="discussion"/>
-      <w:bookmarkEnd w:id="6"/>
-      <w:bookmarkEnd w:id="10"/>
+      <w:bookmarkStart w:id="12" w:name="discussion"/>
+      <w:bookmarkEnd w:id="7"/>
+      <w:bookmarkEnd w:id="11"/>
       <w:r>
         <w:t>Discussion</w:t>
       </w:r>
@@ -1351,15 +1371,15 @@
       </w:r>
     </w:p>
     <w:p>
-      <w:bookmarkStart w:id="12" w:name="acknowledgements"/>
-      <w:bookmarkEnd w:id="11"/>
+      <w:bookmarkStart w:id="13" w:name="acknowledgements"/>
+      <w:bookmarkEnd w:id="12"/>
     </w:p>
     <w:p>
       <w:pPr>
         <w:pStyle w:val="Heading1"/>
       </w:pPr>
-      <w:bookmarkStart w:id="13" w:name="references"/>
-      <w:bookmarkEnd w:id="12"/>
+      <w:bookmarkStart w:id="14" w:name="references"/>
+      <w:bookmarkEnd w:id="13"/>
       <w:r>
         <w:t>References</w:t>
       </w:r>
@@ -1368,8 +1388,8 @@
       <w:pPr>
         <w:pStyle w:val="Bibliography"/>
       </w:pPr>
-      <w:bookmarkStart w:id="14" w:name="ref-andersson1994"/>
-      <w:bookmarkStart w:id="15" w:name="refs"/>
+      <w:bookmarkStart w:id="15" w:name="ref-andersson1994"/>
+      <w:bookmarkStart w:id="16" w:name="refs"/>
       <w:r>
         <w:t xml:space="preserve">Andersson, M. B. (1994). </w:t>
       </w:r>
@@ -1388,8 +1408,8 @@
       <w:pPr>
         <w:pStyle w:val="Bibliography"/>
       </w:pPr>
-      <w:bookmarkStart w:id="16" w:name="ref-blanckenhorn2000"/>
-      <w:bookmarkEnd w:id="14"/>
+      <w:bookmarkStart w:id="17" w:name="ref-blanckenhorn2000"/>
+      <w:bookmarkEnd w:id="15"/>
       <w:r>
         <w:t xml:space="preserve">Blanckenhorn, W. U. (2000). The evolution of body size: What keeps organisms small? </w:t>
       </w:r>
@@ -1418,8 +1438,8 @@
       <w:pPr>
         <w:pStyle w:val="Bibliography"/>
       </w:pPr>
-      <w:bookmarkStart w:id="17" w:name="ref-blanckenhorn2005"/>
-      <w:bookmarkEnd w:id="16"/>
+      <w:bookmarkStart w:id="18" w:name="ref-blanckenhorn2005"/>
+      <w:bookmarkEnd w:id="17"/>
       <w:r>
         <w:t xml:space="preserve">Blanckenhorn, W. U. (2005). Behavioral causes and consequences of sexual size dimorphism. </w:t>
       </w:r>
@@ -1456,8 +1476,8 @@
       <w:pPr>
         <w:pStyle w:val="Bibliography"/>
       </w:pPr>
-      <w:bookmarkStart w:id="18" w:name="ref-bonduriansky2001"/>
-      <w:bookmarkEnd w:id="17"/>
+      <w:bookmarkStart w:id="19" w:name="ref-bonduriansky2001"/>
+      <w:bookmarkEnd w:id="18"/>
       <w:r>
         <w:t xml:space="preserve">Bonduriansky, R. (2001). The evolution of Male mate choice in insects: A synthesis of ideas and evidence. </w:t>
       </w:r>
@@ -1494,8 +1514,8 @@
       <w:pPr>
         <w:pStyle w:val="Bibliography"/>
       </w:pPr>
-      <w:bookmarkStart w:id="19" w:name="ref-brodie1995"/>
-      <w:bookmarkEnd w:id="18"/>
+      <w:bookmarkStart w:id="20" w:name="ref-brodie1995"/>
+      <w:bookmarkEnd w:id="19"/>
       <w:r>
         <w:t xml:space="preserve">Brodie, E. D., Moore, A. J., &amp; Janzen, F. J. (1995). Visualizing and quantifying natural selection. </w:t>
       </w:r>
@@ -1532,8 +1552,8 @@
       <w:pPr>
         <w:pStyle w:val="Bibliography"/>
       </w:pPr>
-      <w:bookmarkStart w:id="20" w:name="ref-brown2017"/>
-      <w:bookmarkEnd w:id="19"/>
+      <w:bookmarkStart w:id="21" w:name="ref-brown2017"/>
+      <w:bookmarkEnd w:id="20"/>
       <w:r>
         <w:t xml:space="preserve">Brown, S. D. J. (2017). Austromonticola, a new genus of broad-nosed weevil (Coleoptera, Curculionidae, Entiminae) from montane areas of New Zealand. </w:t>
       </w:r>
@@ -1560,8 +1580,8 @@
       <w:pPr>
         <w:pStyle w:val="Bibliography"/>
       </w:pPr>
-      <w:bookmarkStart w:id="21" w:name="ref-crespi1989"/>
-      <w:bookmarkEnd w:id="20"/>
+      <w:bookmarkStart w:id="22" w:name="ref-crespi1989"/>
+      <w:bookmarkEnd w:id="21"/>
       <w:r>
         <w:t xml:space="preserve">Crespi, B. J. (1989). Causes of assortative mating in arthropods. </w:t>
       </w:r>
@@ -1598,8 +1618,8 @@
       <w:pPr>
         <w:pStyle w:val="Bibliography"/>
       </w:pPr>
-      <w:bookmarkStart w:id="22" w:name="ref-crudgington2000"/>
-      <w:bookmarkEnd w:id="21"/>
+      <w:bookmarkStart w:id="23" w:name="ref-crudgington2000"/>
+      <w:bookmarkEnd w:id="22"/>
       <w:r>
         <w:t xml:space="preserve">Crudgington, H. S., &amp; Siva-Jothy, M. T. (2000). Genital damage, kicking and early death. </w:t>
       </w:r>
@@ -1636,8 +1656,8 @@
       <w:pPr>
         <w:pStyle w:val="Bibliography"/>
       </w:pPr>
-      <w:bookmarkStart w:id="23" w:name="ref-darwin1871"/>
-      <w:bookmarkEnd w:id="22"/>
+      <w:bookmarkStart w:id="24" w:name="ref-darwin1871"/>
+      <w:bookmarkEnd w:id="23"/>
       <w:r>
         <w:t xml:space="preserve">Darwin, C. (1871). </w:t>
       </w:r>
@@ -1664,8 +1684,8 @@
       <w:pPr>
         <w:pStyle w:val="Bibliography"/>
       </w:pPr>
-      <w:bookmarkStart w:id="24" w:name="ref-emlen1977"/>
-      <w:bookmarkEnd w:id="23"/>
+      <w:bookmarkStart w:id="25" w:name="ref-emlen1977"/>
+      <w:bookmarkEnd w:id="24"/>
       <w:r>
         <w:t xml:space="preserve">Emlen, S. T., &amp; Oring, L. W. (1977). Ecology, sexual selection, and the evolution of mating systems. </w:t>
       </w:r>
@@ -1702,8 +1722,8 @@
       <w:pPr>
         <w:pStyle w:val="Bibliography"/>
       </w:pPr>
-      <w:bookmarkStart w:id="25" w:name="ref-fairbairnAllometrySexualSize1997"/>
-      <w:bookmarkEnd w:id="24"/>
+      <w:bookmarkStart w:id="26" w:name="ref-fairbairnAllometrySexualSize1997"/>
+      <w:bookmarkEnd w:id="25"/>
       <w:r>
         <w:t xml:space="preserve">Fairbairn, D. J. (1997). Allometry for sexual size dimorphism: Pattern and process in the coevolution of body size in males and females. </w:t>
       </w:r>
@@ -1740,8 +1760,8 @@
       <w:pPr>
         <w:pStyle w:val="Bibliography"/>
       </w:pPr>
-      <w:bookmarkStart w:id="26" w:name="ref-fairbairn2007"/>
-      <w:bookmarkEnd w:id="25"/>
+      <w:bookmarkStart w:id="27" w:name="ref-fairbairn2007"/>
+      <w:bookmarkEnd w:id="26"/>
       <w:r>
         <w:t xml:space="preserve">Fairbairn, D. J., Blanckenhorn, W. U., &amp; Székely, T. (2007). </w:t>
       </w:r>
@@ -1760,8 +1780,8 @@
       <w:pPr>
         <w:pStyle w:val="Bibliography"/>
       </w:pPr>
-      <w:bookmarkStart w:id="27" w:name="ref-ghiselin1974"/>
-      <w:bookmarkEnd w:id="26"/>
+      <w:bookmarkStart w:id="28" w:name="ref-ghiselin1974"/>
+      <w:bookmarkEnd w:id="27"/>
       <w:r>
         <w:t xml:space="preserve">Ghiselin, M. T. (1974). </w:t>
       </w:r>
@@ -1780,8 +1800,8 @@
       <w:pPr>
         <w:pStyle w:val="Bibliography"/>
       </w:pPr>
-      <w:bookmarkStart w:id="28" w:name="ref-zotero-item-15212"/>
-      <w:bookmarkEnd w:id="27"/>
+      <w:bookmarkStart w:id="29" w:name="ref-zotero-item-15212"/>
+      <w:bookmarkEnd w:id="28"/>
       <w:r>
         <w:lastRenderedPageBreak/>
         <w:t xml:space="preserve">Guidelines for the ethical treatment of nonhuman animals in behavioural research and teaching. (2023). In </w:t>
@@ -1801,8 +1821,8 @@
       <w:pPr>
         <w:pStyle w:val="Bibliography"/>
       </w:pPr>
-      <w:bookmarkStart w:id="29" w:name="ref-haran2023"/>
-      <w:bookmarkEnd w:id="28"/>
+      <w:bookmarkStart w:id="30" w:name="ref-haran2023"/>
+      <w:bookmarkEnd w:id="29"/>
       <w:r>
         <w:t xml:space="preserve">Haran, J., Li, X., Allio, R., Shin, S., Benoit, L., Oberprieler, R. G., Farrell, B. D., Brown, S. D. J., Leschen, R. A. B., Kergoat, G. J., &amp; McKenna, D. D. (2023). Phylogenomics illuminates the phylogeny of flower weevils (Curculioninae) and reveals ten independent origins of brood-site pollination mutualism in true weevils. </w:t>
       </w:r>
@@ -1839,8 +1859,8 @@
       <w:pPr>
         <w:pStyle w:val="Bibliography"/>
       </w:pPr>
-      <w:bookmarkStart w:id="30" w:name="ref-harari1999"/>
-      <w:bookmarkEnd w:id="29"/>
+      <w:bookmarkStart w:id="31" w:name="ref-harari1999"/>
+      <w:bookmarkEnd w:id="30"/>
       <w:r>
         <w:t xml:space="preserve">Harari, A. R., Handler, A. M., &amp; Landolt, P. J. (1999). Size-assortative mating, male choice and female choice in the curculionid beetle </w:t>
       </w:r>
@@ -1889,8 +1909,8 @@
       <w:pPr>
         <w:pStyle w:val="Bibliography"/>
       </w:pPr>
-      <w:bookmarkStart w:id="31" w:name="ref-herberstein2017"/>
-      <w:bookmarkEnd w:id="30"/>
+      <w:bookmarkStart w:id="32" w:name="ref-herberstein2017"/>
+      <w:bookmarkEnd w:id="31"/>
       <w:r>
         <w:t xml:space="preserve">Herberstein, M. E., Painting, C. J., &amp; Holwell, G. I. (2017). Scramble competition polygyny in terrestrial arthropods. In </w:t>
       </w:r>
@@ -1917,8 +1937,8 @@
       <w:pPr>
         <w:pStyle w:val="Bibliography"/>
       </w:pPr>
-      <w:bookmarkStart w:id="32" w:name="ref-honek1993"/>
-      <w:bookmarkEnd w:id="31"/>
+      <w:bookmarkStart w:id="33" w:name="ref-honek1993"/>
+      <w:bookmarkEnd w:id="32"/>
       <w:r>
         <w:t xml:space="preserve">Honek, A. (1993). Intraspecific variation in body size and fecundity in insects: A general relationship. </w:t>
       </w:r>
@@ -1945,8 +1965,8 @@
       <w:pPr>
         <w:pStyle w:val="Bibliography"/>
       </w:pPr>
-      <w:bookmarkStart w:id="33" w:name="ref-jiang2013"/>
-      <w:bookmarkEnd w:id="32"/>
+      <w:bookmarkStart w:id="34" w:name="ref-jiang2013"/>
+      <w:bookmarkEnd w:id="33"/>
       <w:r>
         <w:t xml:space="preserve">Jiang, Y., Bolnick, D. I., &amp; Kirkpatrick, M. (2013). Assortative mating in animals. </w:t>
       </w:r>
@@ -1983,8 +2003,8 @@
       <w:pPr>
         <w:pStyle w:val="Bibliography"/>
       </w:pPr>
-      <w:bookmarkStart w:id="34" w:name="ref-kaufmann2021"/>
-      <w:bookmarkEnd w:id="33"/>
+      <w:bookmarkStart w:id="35" w:name="ref-kaufmann2021"/>
+      <w:bookmarkEnd w:id="34"/>
       <w:r>
         <w:t xml:space="preserve">Kaufmann, P., Wolak, M. E., Husby, A., &amp; Immonen, E. (2021). Rapid evolution of sexual size dimorphism facilitated by Y-linked genetic variance. </w:t>
       </w:r>
@@ -2021,8 +2041,8 @@
       <w:pPr>
         <w:pStyle w:val="Bibliography"/>
       </w:pPr>
-      <w:bookmarkStart w:id="35" w:name="ref-kelly2020"/>
-      <w:bookmarkEnd w:id="34"/>
+      <w:bookmarkStart w:id="36" w:name="ref-kelly2020"/>
+      <w:bookmarkEnd w:id="35"/>
       <w:r>
         <w:t>Kelly, C. D. (2020). Sexual selection on the size and shape of morphological traits in the Japanese beetle (</w:t>
       </w:r>
@@ -2079,8 +2099,8 @@
       <w:pPr>
         <w:pStyle w:val="Bibliography"/>
       </w:pPr>
-      <w:bookmarkStart w:id="36" w:name="ref-kelly2008a"/>
-      <w:bookmarkEnd w:id="35"/>
+      <w:bookmarkStart w:id="37" w:name="ref-kelly2008a"/>
+      <w:bookmarkEnd w:id="36"/>
       <w:r>
         <w:t xml:space="preserve">Kelly, C. D., Bussière, L. F., &amp; Gwynne, D. T. (2008). Sexual selection for male mobility in a giant insect with female-biased size dimorphism. </w:t>
       </w:r>
@@ -2117,8 +2137,8 @@
       <w:pPr>
         <w:pStyle w:val="Bibliography"/>
       </w:pPr>
-      <w:bookmarkStart w:id="37" w:name="ref-kelly2023c"/>
-      <w:bookmarkEnd w:id="36"/>
+      <w:bookmarkStart w:id="38" w:name="ref-kelly2023c"/>
+      <w:bookmarkEnd w:id="37"/>
       <w:r>
         <w:t xml:space="preserve">Kelly, C. D., &amp; Gwynne, D. T. (2023). Mating assortment and the strength of sexual selection in a polyandrous population of Cook Strait giant weta. </w:t>
       </w:r>
@@ -2155,8 +2175,8 @@
       <w:pPr>
         <w:pStyle w:val="Bibliography"/>
       </w:pPr>
-      <w:bookmarkStart w:id="38" w:name="ref-kelly2024b"/>
-      <w:bookmarkEnd w:id="37"/>
+      <w:bookmarkStart w:id="39" w:name="ref-kelly2024b"/>
+      <w:bookmarkEnd w:id="38"/>
       <w:r>
         <w:t xml:space="preserve">Kelly, C. D., Peruzzini, W., Chasse-Bilodeau, R., Roche, D. G., &amp; Olivier-Montiglio, P. (2024). Effect of age and mating on body condition, fecundity and metabolic rate in female sand crickets,. </w:t>
       </w:r>
@@ -2193,8 +2213,8 @@
       <w:pPr>
         <w:pStyle w:val="Bibliography"/>
       </w:pPr>
-      <w:bookmarkStart w:id="39" w:name="ref-kingsolver2004"/>
-      <w:bookmarkEnd w:id="38"/>
+      <w:bookmarkStart w:id="40" w:name="ref-kingsolver2004"/>
+      <w:bookmarkEnd w:id="39"/>
       <w:r>
         <w:t xml:space="preserve">Kingsolver, J. G., &amp; Pfennig, D. W. (2004). Individual-level selection as a cause of Cope’s rule of phyletic size increase. </w:t>
       </w:r>
@@ -2231,8 +2251,8 @@
       <w:pPr>
         <w:pStyle w:val="Bibliography"/>
       </w:pPr>
-      <w:bookmarkStart w:id="40" w:name="ref-lande1983"/>
-      <w:bookmarkEnd w:id="39"/>
+      <w:bookmarkStart w:id="41" w:name="ref-lande1983"/>
+      <w:bookmarkEnd w:id="40"/>
       <w:r>
         <w:lastRenderedPageBreak/>
         <w:t xml:space="preserve">Lande, R., &amp; Arnold, S. J. (1983). The measurement of selection on correlated characters. </w:t>
@@ -2270,8 +2290,8 @@
       <w:pPr>
         <w:pStyle w:val="Bibliography"/>
       </w:pPr>
-      <w:bookmarkStart w:id="41" w:name="ref-may1993"/>
-      <w:bookmarkEnd w:id="40"/>
+      <w:bookmarkStart w:id="42" w:name="ref-may1993"/>
+      <w:bookmarkEnd w:id="41"/>
       <w:r>
         <w:t xml:space="preserve">May, B. M. (1993). Larvae of Curculionoidea (Insecta: Coleoptera): A systematic overview. </w:t>
       </w:r>
@@ -2300,8 +2320,8 @@
       <w:pPr>
         <w:pStyle w:val="Bibliography"/>
       </w:pPr>
-      <w:bookmarkStart w:id="42" w:name="ref-mcdonald2016"/>
-      <w:bookmarkEnd w:id="41"/>
+      <w:bookmarkStart w:id="43" w:name="ref-mcdonald2016"/>
+      <w:bookmarkEnd w:id="42"/>
       <w:r>
         <w:t xml:space="preserve">McDonald, G. C., &amp; Pizzari, T. (2016). Why patterns of assortative mating are key to study sexual selection and how to measure them. </w:t>
       </w:r>
@@ -2338,8 +2358,8 @@
       <w:pPr>
         <w:pStyle w:val="Bibliography"/>
       </w:pPr>
-      <w:bookmarkStart w:id="43" w:name="ref-morrissey2013"/>
-      <w:bookmarkEnd w:id="42"/>
+      <w:bookmarkStart w:id="44" w:name="ref-morrissey2013"/>
+      <w:bookmarkEnd w:id="43"/>
       <w:r>
         <w:t xml:space="preserve">Morrissey, M. B., &amp; Sakrejda, K. (2013). Unification of regression-based methods for the analysis of natural selection. </w:t>
       </w:r>
@@ -2376,8 +2396,8 @@
       <w:pPr>
         <w:pStyle w:val="Bibliography"/>
       </w:pPr>
-      <w:bookmarkStart w:id="44" w:name="ref-moya-larano2002"/>
-      <w:bookmarkEnd w:id="43"/>
+      <w:bookmarkStart w:id="45" w:name="ref-moya-larano2002"/>
+      <w:bookmarkEnd w:id="44"/>
       <w:r>
         <w:t xml:space="preserve">Moya-Laraño, J., Halaj, J., &amp; Wise, D. H. (2002). Climbing to reach females: Romeo should be small. </w:t>
       </w:r>
@@ -2406,8 +2426,8 @@
       <w:pPr>
         <w:pStyle w:val="Bibliography"/>
       </w:pPr>
-      <w:bookmarkStart w:id="45" w:name="ref-phillips1989"/>
-      <w:bookmarkEnd w:id="44"/>
+      <w:bookmarkStart w:id="46" w:name="ref-phillips1989"/>
+      <w:bookmarkEnd w:id="45"/>
       <w:r>
         <w:t xml:space="preserve">Phillips, P. C., &amp; Arnold, S. J. (1989). Visualizing multivariate selection. </w:t>
       </w:r>
@@ -2444,8 +2464,8 @@
       <w:pPr>
         <w:pStyle w:val="Bibliography"/>
       </w:pPr>
-      <w:bookmarkStart w:id="46" w:name="ref-pincheira-donoso2017"/>
-      <w:bookmarkEnd w:id="45"/>
+      <w:bookmarkStart w:id="47" w:name="ref-pincheira-donoso2017"/>
+      <w:bookmarkEnd w:id="46"/>
       <w:r>
         <w:t xml:space="preserve">Pincheira-Donoso, D., &amp; Hunt, J. (2017). Fecundity selection theory: Concepts and evidence. </w:t>
       </w:r>
@@ -2474,8 +2494,8 @@
       <w:pPr>
         <w:pStyle w:val="Bibliography"/>
       </w:pPr>
-      <w:bookmarkStart w:id="47" w:name="ref-rcoreteam2025"/>
-      <w:bookmarkEnd w:id="46"/>
+      <w:bookmarkStart w:id="48" w:name="ref-rcoreteam2025"/>
+      <w:bookmarkEnd w:id="47"/>
       <w:r>
         <w:t xml:space="preserve">R Core Team. (2025). </w:t>
       </w:r>
@@ -2494,8 +2514,8 @@
       <w:pPr>
         <w:pStyle w:val="Bibliography"/>
       </w:pPr>
-      <w:bookmarkStart w:id="48" w:name="ref-schindelin2012"/>
-      <w:bookmarkEnd w:id="47"/>
+      <w:bookmarkStart w:id="49" w:name="ref-schindelin2012"/>
+      <w:bookmarkEnd w:id="48"/>
       <w:r>
         <w:t xml:space="preserve">Schindelin, J., Arganda-Carreras, I., Frise, E., Kaynig, V., Longair, M., Pietzsch, T., Preibisch, S., Rueden, C., Saalfeld, S., Schmid, B., Tinevez, J.-Y., White, D. J., Hartenstein, V., Eliceiri, K., Tomancak, P., &amp; Cardona, A. (2012). Fiji: An open-source platform for biological-image analysis. </w:t>
       </w:r>
@@ -2532,8 +2552,8 @@
       <w:pPr>
         <w:pStyle w:val="Bibliography"/>
       </w:pPr>
-      <w:bookmarkStart w:id="49" w:name="ref-vasudeva2025"/>
-      <w:bookmarkEnd w:id="48"/>
+      <w:bookmarkStart w:id="50" w:name="ref-vasudeva2025"/>
+      <w:bookmarkEnd w:id="49"/>
       <w:r>
         <w:t xml:space="preserve">Vasudeva, R., Sales, K., Gage, M. J. G., &amp; Hosken, D. J. (2025). Inbreeding depression in Male reproductive traits. </w:t>
       </w:r>
@@ -2570,8 +2590,8 @@
       <w:pPr>
         <w:pStyle w:val="Bibliography"/>
       </w:pPr>
-      <w:bookmarkStart w:id="50" w:name="ref-venables2002"/>
-      <w:bookmarkEnd w:id="49"/>
+      <w:bookmarkStart w:id="51" w:name="ref-venables2002"/>
+      <w:bookmarkEnd w:id="50"/>
       <w:r>
         <w:rPr>
           <w:lang w:val="fr-CA"/>
@@ -2593,8 +2613,8 @@
       <w:pPr>
         <w:pStyle w:val="Bibliography"/>
       </w:pPr>
-      <w:bookmarkStart w:id="51" w:name="ref-wood2017"/>
-      <w:bookmarkEnd w:id="50"/>
+      <w:bookmarkStart w:id="52" w:name="ref-wood2017"/>
+      <w:bookmarkEnd w:id="51"/>
       <w:r>
         <w:t xml:space="preserve">Wood, S. N. (2017). </w:t>
       </w:r>
@@ -2621,8 +2641,8 @@
       <w:pPr>
         <w:pStyle w:val="Bibliography"/>
       </w:pPr>
-      <w:bookmarkStart w:id="52" w:name="ref-zhu2025"/>
-      <w:bookmarkEnd w:id="51"/>
+      <w:bookmarkStart w:id="53" w:name="ref-zhu2025"/>
+      <w:bookmarkEnd w:id="52"/>
       <w:r>
         <w:t xml:space="preserve">Zhu, M., Niklas, K. J., Chen, L., Wang, L., Jiao, Y., &amp; Shi, P. (2025). Scaling relationships and sexual size dimorphism among the body parts of </w:t>
       </w:r>
@@ -2675,8 +2695,8 @@
         </w:r>
       </w:hyperlink>
     </w:p>
-    <w:bookmarkEnd w:id="15"/>
-    <w:bookmarkEnd w:id="52"/>
+    <w:bookmarkEnd w:id="16"/>
+    <w:bookmarkEnd w:id="53"/>
     <w:p>
       <w:r>
         <w:br w:type="page"/>
@@ -2714,7 +2734,7 @@
               <w:pStyle w:val="ImageCaption"/>
               <w:spacing w:before="200"/>
             </w:pPr>
-            <w:bookmarkStart w:id="53" w:name="tbl-one"/>
+            <w:bookmarkStart w:id="54" w:name="tbl-one"/>
             <w:r>
               <w:lastRenderedPageBreak/>
               <w:t xml:space="preserve">Table 1: Selection differentials (S, C) and standardized linear (β) and diagonal quadratic (γ) selection gradients through observed pairing status for female and male </w:t>
@@ -7034,7 +7054,7 @@
                 </w:p>
               </w:tc>
             </w:tr>
-            <w:bookmarkEnd w:id="53"/>
+            <w:bookmarkEnd w:id="54"/>
           </w:tbl>
           <w:p>
             <w:pPr>
@@ -7073,7 +7093,7 @@
               <w:pStyle w:val="Compact"/>
               <w:jc w:val="center"/>
             </w:pPr>
-            <w:bookmarkStart w:id="54" w:name="fig-one"/>
+            <w:bookmarkStart w:id="55" w:name="fig-one"/>
           </w:p>
           <w:p>
             <w:pPr>
@@ -7095,7 +7115,7 @@
             </w:r>
           </w:p>
         </w:tc>
-        <w:bookmarkEnd w:id="54"/>
+        <w:bookmarkEnd w:id="55"/>
       </w:tr>
     </w:tbl>
     <w:p>
@@ -7126,7 +7146,7 @@
               <w:pStyle w:val="Compact"/>
               <w:jc w:val="center"/>
             </w:pPr>
-            <w:bookmarkStart w:id="55" w:name="fig-two"/>
+            <w:bookmarkStart w:id="56" w:name="fig-two"/>
           </w:p>
           <w:p>
             <w:pPr>
@@ -7138,7 +7158,7 @@
             </w:r>
           </w:p>
         </w:tc>
-        <w:bookmarkEnd w:id="55"/>
+        <w:bookmarkEnd w:id="56"/>
       </w:tr>
     </w:tbl>
     <w:p>
@@ -7169,7 +7189,7 @@
               <w:pStyle w:val="Compact"/>
               <w:jc w:val="center"/>
             </w:pPr>
-            <w:bookmarkStart w:id="56" w:name="fig-three"/>
+            <w:bookmarkStart w:id="57" w:name="fig-three"/>
           </w:p>
           <w:p>
             <w:pPr>
@@ -7181,7 +7201,7 @@
             </w:r>
           </w:p>
         </w:tc>
-        <w:bookmarkEnd w:id="56"/>
+        <w:bookmarkEnd w:id="57"/>
       </w:tr>
     </w:tbl>
     <w:p>
@@ -7212,7 +7232,7 @@
               <w:pStyle w:val="Compact"/>
               <w:jc w:val="center"/>
             </w:pPr>
-            <w:bookmarkStart w:id="57" w:name="fig-four"/>
+            <w:bookmarkStart w:id="58" w:name="fig-four"/>
           </w:p>
           <w:p>
             <w:pPr>
@@ -7228,7 +7248,7 @@
             </w:r>
           </w:p>
         </w:tc>
-        <w:bookmarkEnd w:id="57"/>
+        <w:bookmarkEnd w:id="58"/>
       </w:tr>
     </w:tbl>
     <w:p>
@@ -7260,7 +7280,7 @@
               <w:pStyle w:val="Compact"/>
               <w:jc w:val="center"/>
             </w:pPr>
-            <w:bookmarkStart w:id="58" w:name="fig-five"/>
+            <w:bookmarkStart w:id="59" w:name="fig-five"/>
           </w:p>
           <w:p>
             <w:pPr>
@@ -7272,9 +7292,9 @@
             </w:r>
           </w:p>
         </w:tc>
-        <w:bookmarkEnd w:id="58"/>
+        <w:bookmarkEnd w:id="59"/>
       </w:tr>
-      <w:bookmarkEnd w:id="13"/>
+      <w:bookmarkEnd w:id="14"/>
     </w:tbl>
     <w:p/>
     <w:sectPr>

</xml_diff>